<commit_message>
Took links out of TOC.
</commit_message>
<xml_diff>
--- a/chapters/intro.docx
+++ b/chapters/intro.docx
@@ -1364,7 +1364,7 @@
           <w:szCs w:val="24"/>
           <w:rtl w:val="0"/>
         </w:rPr>
-        <w:t xml:space="preserve">As the analysis of each chapter above shows, the entries in this volume make fresh contributions, through critical analysis, exposition, and reconstruction, to the discourse on the justification of the state. A singular framework is not adopted as the lens through which the state is analyzed, morally interrogated, justified, or rejected. The contributors proceed from different philosophical traditions and justificatory grounds. Each contribution, therefore retains a distinct voice while extending the conversation on the justification of the state. </w:t>
+        <w:t xml:space="preserve">As the analysis of each chapter above shows, the entries in this volume make fresh contributions, through critical analysis, exposition, and reconstruction, to the discourse on the justification of the state. A singular framework is not adopted as the lens through which the state is analyzed, morally interrogated, justified, or rejected. The contributors proceed from different philosophical traditions and justificatory grounds. Each contribution retains a distinct voice while extending the conversation on the justification of the state. </w:t>
       </w:r>
     </w:p>
     <w:p>
@@ -1380,7 +1380,7 @@
           <w:szCs w:val="24"/>
           <w:rtl w:val="0"/>
         </w:rPr>
-        <w:t xml:space="preserve">While going through this volume, readers will discover that the justification of the state remains a complex philosophical problem. The nature of disagreement on whether the state can be justified, the extent to which such justification might proceed, and the scope of the authority that may follow from it, and what precisely the justification must entail, will provoke further discourse. This volume, therefore, shows that the justification of the state remains open to different philosophical arguments and conclusions.</w:t>
+        <w:t xml:space="preserve">Readers of this volume will discover that the justification of the state remains a complex philosophical problem. The nature of disagreement on whether the state can be justified, the ways in which such justification might proceed, and the scope of the authority that might follow from it will provoke further discourse. This volume demonstrates that this topic continues to provoke lively discussion.</w:t>
       </w:r>
       <w:r>
         <w:rPr>

</xml_diff>